<commit_message>
System complete, populate the database, test and adjust the E-R diagram
</commit_message>
<xml_diff>
--- a/database/LUNA BAY RESORT DATABASE.docx
+++ b/database/LUNA BAY RESORT DATABASE.docx
@@ -819,21 +819,6 @@
           <w:sz w:val="28"/>
           <w:szCs w:val="28"/>
         </w:rPr>
-        <w:t xml:space="preserve">    id INT AUTO_INCREMENT PRIMARY KEY,</w:t>
-      </w:r>
-    </w:p>
-    <w:p>
-      <w:pPr>
-        <w:rPr>
-          <w:sz w:val="28"/>
-          <w:szCs w:val="28"/>
-        </w:rPr>
-      </w:pPr>
-      <w:r>
-        <w:rPr>
-          <w:sz w:val="28"/>
-          <w:szCs w:val="28"/>
-        </w:rPr>
         <w:t xml:space="preserve">    </w:t>
       </w:r>
       <w:proofErr w:type="spellStart"/>
@@ -882,6 +867,37 @@
           <w:szCs w:val="28"/>
         </w:rPr>
         <w:t xml:space="preserve"> INT NOT NULL,</w:t>
+      </w:r>
+    </w:p>
+    <w:p>
+      <w:pPr>
+        <w:rPr>
+          <w:sz w:val="28"/>
+          <w:szCs w:val="28"/>
+        </w:rPr>
+      </w:pPr>
+      <w:r>
+        <w:rPr>
+          <w:sz w:val="28"/>
+          <w:szCs w:val="28"/>
+        </w:rPr>
+        <w:t xml:space="preserve">    </w:t>
+      </w:r>
+      <w:proofErr w:type="spellStart"/>
+      <w:r>
+        <w:rPr>
+          <w:sz w:val="28"/>
+          <w:szCs w:val="28"/>
+        </w:rPr>
+        <w:t>check_in</w:t>
+      </w:r>
+      <w:proofErr w:type="spellEnd"/>
+      <w:r>
+        <w:rPr>
+          <w:sz w:val="28"/>
+          <w:szCs w:val="28"/>
+        </w:rPr>
+        <w:t xml:space="preserve"> DATE NOT NULL,</w:t>
       </w:r>
     </w:p>
     <w:p>
@@ -905,6 +921,162 @@
           <w:sz w:val="28"/>
           <w:szCs w:val="28"/>
         </w:rPr>
+        <w:t>check_out</w:t>
+      </w:r>
+      <w:proofErr w:type="spellEnd"/>
+      <w:r>
+        <w:rPr>
+          <w:sz w:val="28"/>
+          <w:szCs w:val="28"/>
+        </w:rPr>
+        <w:t xml:space="preserve"> DATE NOT NULL,</w:t>
+      </w:r>
+    </w:p>
+    <w:p>
+      <w:pPr>
+        <w:rPr>
+          <w:sz w:val="28"/>
+          <w:szCs w:val="28"/>
+        </w:rPr>
+      </w:pPr>
+      <w:r>
+        <w:rPr>
+          <w:sz w:val="28"/>
+          <w:szCs w:val="28"/>
+        </w:rPr>
+        <w:t xml:space="preserve">    </w:t>
+      </w:r>
+      <w:proofErr w:type="spellStart"/>
+      <w:r>
+        <w:rPr>
+          <w:sz w:val="28"/>
+          <w:szCs w:val="28"/>
+        </w:rPr>
+        <w:t>num_guests</w:t>
+      </w:r>
+      <w:proofErr w:type="spellEnd"/>
+      <w:r>
+        <w:rPr>
+          <w:sz w:val="28"/>
+          <w:szCs w:val="28"/>
+        </w:rPr>
+        <w:t xml:space="preserve"> INT NOT NULL DEFAULT 1,</w:t>
+      </w:r>
+    </w:p>
+    <w:p>
+      <w:pPr>
+        <w:rPr>
+          <w:sz w:val="28"/>
+          <w:szCs w:val="28"/>
+        </w:rPr>
+      </w:pPr>
+      <w:r>
+        <w:rPr>
+          <w:sz w:val="28"/>
+          <w:szCs w:val="28"/>
+        </w:rPr>
+        <w:t xml:space="preserve">    </w:t>
+      </w:r>
+      <w:proofErr w:type="spellStart"/>
+      <w:r>
+        <w:rPr>
+          <w:sz w:val="28"/>
+          <w:szCs w:val="28"/>
+        </w:rPr>
+        <w:t>total_price</w:t>
+      </w:r>
+      <w:proofErr w:type="spellEnd"/>
+      <w:r>
+        <w:rPr>
+          <w:sz w:val="28"/>
+          <w:szCs w:val="28"/>
+        </w:rPr>
+        <w:t xml:space="preserve"> DECIMAL(10,2) NOT NULL,</w:t>
+      </w:r>
+    </w:p>
+    <w:p>
+      <w:pPr>
+        <w:rPr>
+          <w:sz w:val="28"/>
+          <w:szCs w:val="28"/>
+        </w:rPr>
+      </w:pPr>
+      <w:r>
+        <w:rPr>
+          <w:sz w:val="28"/>
+          <w:szCs w:val="28"/>
+        </w:rPr>
+        <w:t xml:space="preserve">    </w:t>
+      </w:r>
+      <w:proofErr w:type="spellStart"/>
+      <w:r>
+        <w:rPr>
+          <w:sz w:val="28"/>
+          <w:szCs w:val="28"/>
+        </w:rPr>
+        <w:t>created_at</w:t>
+      </w:r>
+      <w:proofErr w:type="spellEnd"/>
+      <w:r>
+        <w:rPr>
+          <w:sz w:val="28"/>
+          <w:szCs w:val="28"/>
+        </w:rPr>
+        <w:t xml:space="preserve"> TIMESTAMP DEFAULT CURRENT_TIMESTAMP,</w:t>
+      </w:r>
+    </w:p>
+    <w:p>
+      <w:pPr>
+        <w:rPr>
+          <w:sz w:val="28"/>
+          <w:szCs w:val="28"/>
+        </w:rPr>
+      </w:pPr>
+      <w:r>
+        <w:rPr>
+          <w:sz w:val="28"/>
+          <w:szCs w:val="28"/>
+        </w:rPr>
+        <w:t xml:space="preserve">    PRIMARY KEY (</w:t>
+      </w:r>
+      <w:proofErr w:type="spellStart"/>
+      <w:r>
+        <w:rPr>
+          <w:sz w:val="28"/>
+          <w:szCs w:val="28"/>
+        </w:rPr>
+        <w:t>guest_id</w:t>
+      </w:r>
+      <w:proofErr w:type="spellEnd"/>
+      <w:r>
+        <w:rPr>
+          <w:sz w:val="28"/>
+          <w:szCs w:val="28"/>
+        </w:rPr>
+        <w:t xml:space="preserve">, </w:t>
+      </w:r>
+      <w:proofErr w:type="spellStart"/>
+      <w:r>
+        <w:rPr>
+          <w:sz w:val="28"/>
+          <w:szCs w:val="28"/>
+        </w:rPr>
+        <w:t>room_id</w:t>
+      </w:r>
+      <w:proofErr w:type="spellEnd"/>
+      <w:r>
+        <w:rPr>
+          <w:sz w:val="28"/>
+          <w:szCs w:val="28"/>
+        </w:rPr>
+        <w:t xml:space="preserve">, </w:t>
+      </w:r>
+      <w:proofErr w:type="spellStart"/>
+      <w:r>
+        <w:rPr>
+          <w:sz w:val="28"/>
+          <w:szCs w:val="28"/>
+        </w:rPr>
         <w:t>check_in</w:t>
       </w:r>
       <w:proofErr w:type="spellEnd"/>
@@ -913,22 +1085,22 @@
           <w:sz w:val="28"/>
           <w:szCs w:val="28"/>
         </w:rPr>
-        <w:t xml:space="preserve"> DATE NOT NULL,</w:t>
-      </w:r>
-    </w:p>
-    <w:p>
-      <w:pPr>
-        <w:rPr>
-          <w:sz w:val="28"/>
-          <w:szCs w:val="28"/>
-        </w:rPr>
-      </w:pPr>
-      <w:r>
-        <w:rPr>
-          <w:sz w:val="28"/>
-          <w:szCs w:val="28"/>
-        </w:rPr>
-        <w:t xml:space="preserve">    </w:t>
+        <w:t>),</w:t>
+      </w:r>
+    </w:p>
+    <w:p>
+      <w:pPr>
+        <w:rPr>
+          <w:sz w:val="28"/>
+          <w:szCs w:val="28"/>
+        </w:rPr>
+      </w:pPr>
+      <w:r>
+        <w:rPr>
+          <w:sz w:val="28"/>
+          <w:szCs w:val="28"/>
+        </w:rPr>
+        <w:t xml:space="preserve">    FOREIGN KEY (</w:t>
       </w:r>
       <w:proofErr w:type="spellStart"/>
       <w:r>
@@ -936,7 +1108,7 @@
           <w:sz w:val="28"/>
           <w:szCs w:val="28"/>
         </w:rPr>
-        <w:t>check_out</w:t>
+        <w:t>guest_id</w:t>
       </w:r>
       <w:proofErr w:type="spellEnd"/>
       <w:r>
@@ -944,22 +1116,22 @@
           <w:sz w:val="28"/>
           <w:szCs w:val="28"/>
         </w:rPr>
-        <w:t xml:space="preserve"> DATE NOT NULL,</w:t>
-      </w:r>
-    </w:p>
-    <w:p>
-      <w:pPr>
-        <w:rPr>
-          <w:sz w:val="28"/>
-          <w:szCs w:val="28"/>
-        </w:rPr>
-      </w:pPr>
-      <w:r>
-        <w:rPr>
-          <w:sz w:val="28"/>
-          <w:szCs w:val="28"/>
-        </w:rPr>
-        <w:t xml:space="preserve">    </w:t>
+        <w:t>) REFERENCES guests(id) ON DELETE CASCADE,</w:t>
+      </w:r>
+    </w:p>
+    <w:p>
+      <w:pPr>
+        <w:rPr>
+          <w:sz w:val="28"/>
+          <w:szCs w:val="28"/>
+        </w:rPr>
+      </w:pPr>
+      <w:r>
+        <w:rPr>
+          <w:sz w:val="28"/>
+          <w:szCs w:val="28"/>
+        </w:rPr>
+        <w:t xml:space="preserve">    FOREIGN KEY (</w:t>
       </w:r>
       <w:proofErr w:type="spellStart"/>
       <w:r>
@@ -967,7 +1139,7 @@
           <w:sz w:val="28"/>
           <w:szCs w:val="28"/>
         </w:rPr>
-        <w:t>num_guests</w:t>
+        <w:t>room_id</w:t>
       </w:r>
       <w:proofErr w:type="spellEnd"/>
       <w:r>
@@ -975,131 +1147,7 @@
           <w:sz w:val="28"/>
           <w:szCs w:val="28"/>
         </w:rPr>
-        <w:t xml:space="preserve"> INT NOT NULL DEFAULT 1,</w:t>
-      </w:r>
-    </w:p>
-    <w:p>
-      <w:pPr>
-        <w:rPr>
-          <w:sz w:val="28"/>
-          <w:szCs w:val="28"/>
-        </w:rPr>
-      </w:pPr>
-      <w:r>
-        <w:rPr>
-          <w:sz w:val="28"/>
-          <w:szCs w:val="28"/>
-        </w:rPr>
-        <w:t xml:space="preserve">    </w:t>
-      </w:r>
-      <w:proofErr w:type="spellStart"/>
-      <w:r>
-        <w:rPr>
-          <w:sz w:val="28"/>
-          <w:szCs w:val="28"/>
-        </w:rPr>
-        <w:t>total_price</w:t>
-      </w:r>
-      <w:proofErr w:type="spellEnd"/>
-      <w:r>
-        <w:rPr>
-          <w:sz w:val="28"/>
-          <w:szCs w:val="28"/>
-        </w:rPr>
-        <w:t xml:space="preserve"> DECIMAL(10,2) NOT NULL,</w:t>
-      </w:r>
-    </w:p>
-    <w:p>
-      <w:pPr>
-        <w:rPr>
-          <w:sz w:val="28"/>
-          <w:szCs w:val="28"/>
-        </w:rPr>
-      </w:pPr>
-      <w:r>
-        <w:rPr>
-          <w:sz w:val="28"/>
-          <w:szCs w:val="28"/>
-        </w:rPr>
-        <w:t xml:space="preserve">    </w:t>
-      </w:r>
-      <w:proofErr w:type="spellStart"/>
-      <w:r>
-        <w:rPr>
-          <w:sz w:val="28"/>
-          <w:szCs w:val="28"/>
-        </w:rPr>
-        <w:t>created_at</w:t>
-      </w:r>
-      <w:proofErr w:type="spellEnd"/>
-      <w:r>
-        <w:rPr>
-          <w:sz w:val="28"/>
-          <w:szCs w:val="28"/>
-        </w:rPr>
-        <w:t xml:space="preserve"> TIMESTAMP DEFAULT CURRENT_TIMESTAMP,</w:t>
-      </w:r>
-    </w:p>
-    <w:p>
-      <w:pPr>
-        <w:rPr>
-          <w:sz w:val="28"/>
-          <w:szCs w:val="28"/>
-        </w:rPr>
-      </w:pPr>
-      <w:r>
-        <w:rPr>
-          <w:sz w:val="28"/>
-          <w:szCs w:val="28"/>
-        </w:rPr>
-        <w:t xml:space="preserve">    FOREIGN KEY (</w:t>
-      </w:r>
-      <w:proofErr w:type="spellStart"/>
-      <w:r>
-        <w:rPr>
-          <w:sz w:val="28"/>
-          <w:szCs w:val="28"/>
-        </w:rPr>
-        <w:t>guest_id</w:t>
-      </w:r>
-      <w:proofErr w:type="spellEnd"/>
-      <w:r>
-        <w:rPr>
-          <w:sz w:val="28"/>
-          <w:szCs w:val="28"/>
-        </w:rPr>
-        <w:t>) REFERENCES guests(id),</w:t>
-      </w:r>
-    </w:p>
-    <w:p>
-      <w:pPr>
-        <w:rPr>
-          <w:sz w:val="28"/>
-          <w:szCs w:val="28"/>
-        </w:rPr>
-      </w:pPr>
-      <w:r>
-        <w:rPr>
-          <w:sz w:val="28"/>
-          <w:szCs w:val="28"/>
-        </w:rPr>
-        <w:t xml:space="preserve">    FOREIGN KEY (</w:t>
-      </w:r>
-      <w:proofErr w:type="spellStart"/>
-      <w:r>
-        <w:rPr>
-          <w:sz w:val="28"/>
-          <w:szCs w:val="28"/>
-        </w:rPr>
-        <w:t>room_id</w:t>
-      </w:r>
-      <w:proofErr w:type="spellEnd"/>
-      <w:r>
-        <w:rPr>
-          <w:sz w:val="28"/>
-          <w:szCs w:val="28"/>
-        </w:rPr>
-        <w:t>) REFERENCES rooms(id)</w:t>
+        <w:t>) REFERENCES rooms(id) ON DELETE CASCADE</w:t>
       </w:r>
     </w:p>
     <w:p>

</xml_diff>